<commit_message>
docs(delivery): finalize unified Hito 1 presentation and documents
Co-Authored-By: Claude Sonnet 5 <noreply@anthropic.com>
Claude-Session: https://claude.ai/code/session_01TsGgioWkUP8bPabPKh51TB
</commit_message>
<xml_diff>
--- a/artifacts/hito1/final-delivery/SAPI_Hito1_Addendum_PostHito_09-09-2026.docx
+++ b/artifacts/hito1/final-delivery/SAPI_Hito1_Addendum_PostHito_09-09-2026.docx
@@ -98,7 +98,7 @@
         <w:spacing w:after="160"/>
       </w:pPr>
       <w:r>
-        <w:t xml:space="preserve">Este addendum documenta trabajo técnico y de gestión realizado entre el 09-09-2026 sobre el mismo repositorio evaluado en el Hito 1 (informe fechado 07-09-2026). Ninguna de las afirmaciones aquí contenidas se presenta como si hubiera existido durante Sprint 1 (03-08 a 31-08-2026) ni como parte del compromiso histórico evaluado el 07-09-2026.</w:t>
+        <w:t xml:space="preserve">Este addendum documenta las mejoras técnicas y de gestión realizadas después del Hito 1 y consolidadas al 09-09-2026, sobre el mismo repositorio evaluado en el Hito 1 (informe fechado 07-09-2026). Ninguna de las afirmaciones aquí contenidas se presenta como si hubiera existido durante Sprint 1 (03-08 a 31-08-2026) ni como parte del compromiso histórico evaluado el 07-09-2026.</w:t>
       </w:r>
     </w:p>
     <w:p>
@@ -210,7 +210,7 @@
         <w:spacing w:after="100"/>
       </w:pPr>
       <w:r>
-        <w:t xml:space="preserve">R4 (SCIENTIFIC_RETRAINING_REPRODUCIBILITY): no se afirma completo — el dataset temporal (10,8 MB) no se versionó en git por licencia de redistribución no confirmada de NASA FIRMS/DMC/Copernicus DEM; queda explícitamente separado y sin resolver.</w:t>
+        <w:t xml:space="preserve">R4 (SCIENTIFIC_RETRAINING_REPRODUCIBILITY): no se considera completo porque el dataset temporal completo (10,8 MB) y todos los insumos históricos necesarios para reconstruir el entrenamiento no forman parte del snapshot reproducible versionado. La licencia de redistribución de NASA FIRMS/DMC/Copernicus DEM no está confirmada y permanece como punto abierto, sin resolver.</w:t>
       </w:r>
     </w:p>
     <w:p>

</xml_diff>